<commit_message>
cập nhật sơ đồ BPMN mục Quy trình xử lí khiếu nại
</commit_message>
<xml_diff>
--- a/do-an/Chuong_2/Bao_cao/Tran Ngoc Thao Vy_25210242_ Mo hinh hoa quy trinh ho tro (Support Process).docx
+++ b/do-an/Chuong_2/Bao_cao/Tran Ngoc Thao Vy_25210242_ Mo hinh hoa quy trinh ho tro (Support Process).docx
@@ -160,6 +160,7 @@
       <w:r>
         <w:rPr>
           <w:rFonts w:asciiTheme="majorHAnsi" w:hAnsiTheme="majorHAnsi" w:cstheme="majorHAnsi"/>
+          <w:noProof/>
           <w:sz w:val="26"/>
           <w:szCs w:val="26"/>
           <w:lang w:val="en-US"/>
@@ -1098,10 +1099,10 @@
           <w:lang w:val="en-US"/>
         </w:rPr>
         <w:drawing>
-          <wp:inline distT="0" distB="0" distL="0" distR="0" wp14:anchorId="489895A8" wp14:editId="6B5A4B71">
-            <wp:extent cx="5731510" cy="2120900"/>
-            <wp:effectExtent l="0" t="0" r="2540" b="0"/>
-            <wp:docPr id="651377109" name="Picture 4"/>
+          <wp:inline distT="0" distB="0" distL="0" distR="0" wp14:anchorId="2B248695" wp14:editId="4D6F58F9">
+            <wp:extent cx="5731510" cy="2320925"/>
+            <wp:effectExtent l="0" t="0" r="2540" b="3175"/>
+            <wp:docPr id="1944033819" name="Picture 4"/>
             <wp:cNvGraphicFramePr>
               <a:graphicFrameLocks xmlns:a="http://schemas.openxmlformats.org/drawingml/2006/main" noChangeAspect="1"/>
             </wp:cNvGraphicFramePr>
@@ -1130,7 +1131,7 @@
                   <pic:spPr bwMode="auto">
                     <a:xfrm>
                       <a:off x="0" y="0"/>
-                      <a:ext cx="5731510" cy="2120900"/>
+                      <a:ext cx="5731510" cy="2320925"/>
                     </a:xfrm>
                     <a:prstGeom prst="rect">
                       <a:avLst/>
@@ -2065,6 +2066,7 @@
       <w:r>
         <w:rPr>
           <w:rFonts w:asciiTheme="majorHAnsi" w:hAnsiTheme="majorHAnsi" w:cstheme="majorHAnsi"/>
+          <w:noProof/>
           <w:sz w:val="26"/>
           <w:szCs w:val="26"/>
           <w:lang w:val="en-US"/>

</xml_diff>